<commit_message>
fix(relatorio): point the assembly note at the right sections
Two of the three references were wrong, and the person picking the document up
found it before anyone here did.

The note sent the reader to 4.2 for the requirements gathering and to 4.4 for
the prototyping. 4.2 is "Etapas do trabalho", a list of five, and the
requirements gathering and the prototyping are items 1 and 3 inside it; 4.4 is
"Tecnologias empregadas", which is not hers to write at all. Only the
accessibility guidelines really do have a section of their own, 4.3.

The note now says where each piece sits: two items of one list, one whole
section, and the matching results in section 5.

While there, the figure point covers the tables too. They carry no number and
no caption, because what number they take depends on how many come before them
in the assembled report, and that was worth saying rather than leaving for
someone to notice.
</commit_message>
<xml_diff>
--- a/assets/Relatorio-IC-Metodologia-e-Resultados.docx
+++ b/assets/Relatorio-IC-Metodologia-e-Resultados.docx
@@ -4717,7 +4717,7 @@
         <w:t xml:space="preserve">Integrar as demais contribuições das seções 4 e 5.</w:t>
       </w:r>
       <w:r>
-        <w:t xml:space="preserve"> O levantamento de requisitos (4.2), as diretrizes de acessibilidade (4.3) e a prototipagem da interface (4.4) aparecem aqui apenas na medida em que condicionaram o desenvolvimento. Cada uma precisa receber o relato de quem a conduziu, com os resultados correspondentes na seção 5.</w:t>
+        <w:t xml:space="preserve"> Três etapas aparecem aqui apenas na medida em que condicionaram o desenvolvimento, e precisam do relato de quem as conduziu. O levantamento de requisitos e a prototipagem da interface são os itens 1 e 3 da lista de 4.2, cada um resumido em um parágrafo. As diretrizes de acessibilidade têm a seção 4.3 inteira. Os resultados correspondentes entram na seção 5.</w:t>
       </w:r>
     </w:p>
     <w:p>
@@ -4737,10 +4737,10 @@
           <w:b/>
           <w:bCs/>
         </w:rPr>
-        <w:t xml:space="preserve">Renumerar as figuras.</w:t>
-      </w:r>
-      <w:r>
-        <w:t xml:space="preserve"> A numeração deste documento começa em 1 e precisa seguir a sequência do relatório completo.</w:t>
+        <w:t xml:space="preserve">Renumerar as figuras e numerar as tabelas.</w:t>
+      </w:r>
+      <w:r>
+        <w:t xml:space="preserve"> A numeração das figuras começa em 1 aqui e precisa seguir a sequência do relatório completo. As tabelas estão sem número e sem legenda, porque a numeração depende de quantas vêm antes delas.</w:t>
       </w:r>
     </w:p>
     <w:p>

</xml_diff>